<commit_message>
6 y empeze la 7
</commit_message>
<xml_diff>
--- a/PHP/UD2  ACT4 - Bucles.docx
+++ b/PHP/UD2  ACT4 - Bucles.docx
@@ -139,7 +139,7 @@
                   <w:sz w:val="72"/>
                   <w:szCs w:val="72"/>
                 </w:rPr>
-                <w:t>Estructuras de control</w:t>
+                <w:t>Bucles</w:t>
               </w:r>
             </w:p>
           </w:sdtContent>
@@ -675,6 +675,7 @@
       <w:r>
         <w:rPr>
           <w:rFonts w:ascii="Segoe UI" w:eastAsia="Times New Roman" w:hAnsi="Segoe UI" w:cs="Segoe UI"/>
+          <w:noProof/>
           <w:color w:val="1D2125"/>
           <w:sz w:val="23"/>
           <w:szCs w:val="23"/>
@@ -745,6 +746,7 @@
       <w:r>
         <w:rPr>
           <w:rFonts w:ascii="Segoe UI" w:eastAsia="Times New Roman" w:hAnsi="Segoe UI" w:cs="Segoe UI"/>
+          <w:noProof/>
           <w:color w:val="1D2125"/>
           <w:sz w:val="23"/>
           <w:szCs w:val="23"/>
@@ -885,6 +887,7 @@
       <w:r>
         <w:rPr>
           <w:rFonts w:ascii="Segoe UI" w:eastAsia="Times New Roman" w:hAnsi="Segoe UI" w:cs="Segoe UI"/>
+          <w:noProof/>
           <w:color w:val="1D2125"/>
           <w:sz w:val="23"/>
           <w:szCs w:val="23"/>
@@ -940,6 +943,7 @@
       <w:r>
         <w:rPr>
           <w:rFonts w:ascii="Segoe UI" w:eastAsia="Times New Roman" w:hAnsi="Segoe UI" w:cs="Segoe UI"/>
+          <w:noProof/>
           <w:color w:val="1D2125"/>
           <w:sz w:val="23"/>
           <w:szCs w:val="23"/>
@@ -1080,6 +1084,7 @@
       <w:r>
         <w:rPr>
           <w:rFonts w:ascii="Segoe UI" w:eastAsia="Times New Roman" w:hAnsi="Segoe UI" w:cs="Segoe UI"/>
+          <w:noProof/>
           <w:color w:val="1D2125"/>
           <w:sz w:val="23"/>
           <w:szCs w:val="23"/>
@@ -1137,6 +1142,7 @@
       <w:r>
         <w:rPr>
           <w:rFonts w:ascii="Segoe UI" w:eastAsia="Times New Roman" w:hAnsi="Segoe UI" w:cs="Segoe UI"/>
+          <w:noProof/>
           <w:color w:val="1D2125"/>
           <w:sz w:val="23"/>
           <w:szCs w:val="23"/>
@@ -1300,6 +1306,7 @@
       <w:r>
         <w:rPr>
           <w:rFonts w:ascii="Segoe UI" w:eastAsia="Times New Roman" w:hAnsi="Segoe UI" w:cs="Segoe UI"/>
+          <w:noProof/>
           <w:color w:val="1D2125"/>
           <w:sz w:val="23"/>
           <w:szCs w:val="23"/>
@@ -1357,6 +1364,7 @@
       <w:r>
         <w:rPr>
           <w:rFonts w:ascii="Segoe UI" w:eastAsia="Times New Roman" w:hAnsi="Segoe UI" w:cs="Segoe UI"/>
+          <w:noProof/>
           <w:color w:val="1D2125"/>
           <w:sz w:val="23"/>
           <w:szCs w:val="23"/>
@@ -1485,6 +1493,7 @@
       <w:r>
         <w:rPr>
           <w:rFonts w:ascii="Segoe UI" w:eastAsia="Times New Roman" w:hAnsi="Segoe UI" w:cs="Segoe UI"/>
+          <w:noProof/>
           <w:color w:val="1D2125"/>
           <w:sz w:val="23"/>
           <w:szCs w:val="23"/>
@@ -1543,6 +1552,7 @@
       <w:r>
         <w:rPr>
           <w:rFonts w:ascii="Segoe UI" w:eastAsia="Times New Roman" w:hAnsi="Segoe UI" w:cs="Segoe UI"/>
+          <w:noProof/>
           <w:color w:val="1D2125"/>
           <w:sz w:val="23"/>
           <w:szCs w:val="23"/>
@@ -1584,8 +1594,6 @@
           </wp:inline>
         </w:drawing>
       </w:r>
-      <w:bookmarkStart w:id="0" w:name="_GoBack"/>
-      <w:bookmarkEnd w:id="0"/>
     </w:p>
     <w:p/>
     <w:sectPr>
@@ -2198,6 +2206,7 @@
   <w:rsids>
     <w:rsidRoot w:val="00142575"/>
     <w:rsid w:val="00142575"/>
+    <w:rsid w:val="00811BFA"/>
     <w:rsid w:val="009D6D2B"/>
     <w:rsid w:val="00B71E9F"/>
     <w:rsid w:val="00B927F1"/>

</xml_diff>